<commit_message>
docs: Documentação PDF + Ajustes nas pastas Documentação Base
</commit_message>
<xml_diff>
--- a/Documentação/Modelo-Engenharia-Software/Modelo-Prototipagem/DOC/PCEDUC-Proposito-e-Requisitos.docx
+++ b/Documentação/Modelo-Engenharia-Software/Modelo-Prototipagem/DOC/PCEDUC-Proposito-e-Requisitos.docx
@@ -255,7 +255,7 @@
         <w:spacing w:after="80"/>
       </w:pPr>
       <w:r>
-        <w:t xml:space="preserve">Plataforma: aplicação web responsiva. Decisão recomendada para reaproveitar a stack já definida (ASP.NET Core MVC) e cumprir o prazo, sem a curva de aprendizado de um app mobile nativo — a confirmar com a equipe.</w:t>
+        <w:t xml:space="preserve">Plataforma: aplicação web com design mobile-first — construída e navegada como um app no celular (telas cheias, navegação por abas inferior, interações touch), mas tecnicamente continua sendo uma aplicação web (ASP.NET Core MVC), sem a curva de aprendizado de um app nativo. Decisão confirmada pela equipe.</w:t>
       </w:r>
     </w:p>
     <w:p>
@@ -1550,7 +1550,7 @@
                 <w:b w:val="false"/>
                 <w:bCs w:val="false"/>
               </w:rPr>
-              <w:t xml:space="preserve">Responsividade</w:t>
+              <w:t xml:space="preserve">Design mobile-first</w:t>
             </w:r>
           </w:p>
         </w:tc>
@@ -1570,7 +1570,7 @@
                 <w:b w:val="false"/>
                 <w:bCs w:val="false"/>
               </w:rPr>
-              <w:t xml:space="preserve">A interface deverá se adaptar a computadores, notebooks, tablets e smartphones.</w:t>
+              <w:t xml:space="preserve">A interface deverá ser projetada prioritariamente para smartphones, com adaptação secundária para tablets e telas maiores.</w:t>
             </w:r>
           </w:p>
         </w:tc>
@@ -3073,7 +3073,7 @@
         <w:spacing w:after="80"/>
       </w:pPr>
       <w:r>
-        <w:t xml:space="preserve">Confirmar se a plataforma será web ou aplicativo mobile nativo (este documento assume web responsivo, pelo prazo).</w:t>
+        <w:t xml:space="preserve">Validar o modelo de XP + peças colecionáveis descrito na Seção 3.</w:t>
       </w:r>
     </w:p>
     <w:p>
@@ -3086,7 +3086,7 @@
         <w:spacing w:after="80"/>
       </w:pPr>
       <w:r>
-        <w:t xml:space="preserve">Validar o modelo de XP + peças colecionáveis descrito na Seção 3.</w:t>
+        <w:t xml:space="preserve">Definir o conceito visual do mascote — fica para a etapa de wireframe/Figma.</w:t>
       </w:r>
     </w:p>
     <w:p>
@@ -3099,33 +3099,7 @@
         <w:spacing w:after="80"/>
       </w:pPr>
       <w:r>
-        <w:t xml:space="preserve">Definir o conceito visual do mascote — fica para a etapa de wireframe/Figma.</w:t>
-      </w:r>
-    </w:p>
-    <w:p>
-      <w:pPr>
-        <w:pStyle w:val="ListParagraph"/>
-        <w:numPr>
-          <w:ilvl w:val="0"/>
-          <w:numId w:val="2"/>
-        </w:numPr>
-        <w:spacing w:after="80"/>
-      </w:pPr>
-      <w:r>
         <w:t xml:space="preserve">Definir os nomes e o conteúdo pedagógico exato de cada trilha e lição.</w:t>
-      </w:r>
-    </w:p>
-    <w:p>
-      <w:pPr>
-        <w:pStyle w:val="ListParagraph"/>
-        <w:numPr>
-          <w:ilvl w:val="0"/>
-          <w:numId w:val="2"/>
-        </w:numPr>
-        <w:spacing w:after="80"/>
-      </w:pPr>
-      <w:r>
-        <w:t xml:space="preserve">Avaliar se a mudança de escopo exige atualização das seções de Introdução e Objetivos do documento oficial PEX-MDL-54.</w:t>
       </w:r>
     </w:p>
     <w:sectPr>

</xml_diff>